<commit_message>
Add project goal and context to final report
</commit_message>
<xml_diff>
--- a/report/Customer Support Agent Evaluation Report.docx
+++ b/report/Customer Support Agent Evaluation Report.docx
@@ -225,10 +225,28 @@
     <w:p/>
     <w:p>
       <w:pPr>
+        <w:pStyle w:val="Heading1"/>
+        <w:keepNext/>
+      </w:pPr>
+      <w:r>
+        <w:t>Project Goal and Context</w:t>
+      </w:r>
+    </w:p>
+    <w:p>
+      <w:pPr>
+        <w:pStyle w:val="BodyText"/>
+        <w:keepNext/>
+      </w:pPr>
+      <w:r>
+        <w:t>This project evaluates an e-commerce customer-support routing agent that assigns each incoming ticket to one of five operational queues: order_status, refund_request, product_issue, account_help, or other. Accurate routing matters because a wrong classification sends the customer to the wrong team, creating avoidable transfers, slower resolution, and additional support effort.</w:t>
+      </w:r>
+    </w:p>
+    <w:p>
+      <w:pPr>
         <w:pStyle w:val="BodyText"/>
       </w:pPr>
       <w:r>
-        <w:t>This report explains how we reviewed the supplied ground truth, analyzed recurring errors, established a reproducible baseline, tested one focused prompt change, inspected LangSmith traces, measured regressions, and calibrated an optional LLM judge.</w:t>
+        <w:t>Our goal was not only to improve this classifier, but to learn and demonstrate a repeatable agent-evaluation process that can be applied to future AI systems. Using a fixed 150-ticket labeled dataset, we reviewed the ground truth, established a reproducible baseline, annotated and clustered recurring failures, selected one high-impact category, made one focused prompt change, and reran the same cases to measure improvements and regressions. LangSmith traces connected aggregate metrics to individual decisions, while an LLM judge was calibrated against human labels. This report documents both the measured result and the evaluation workflow that produced it.</w:t>
       </w:r>
     </w:p>
     <w:tbl>

</xml_diff>